<commit_message>
This is New Update 3.0
</commit_message>
<xml_diff>
--- a/DXEL_Network_Company_Profile.docx
+++ b/DXEL_Network_Company_Profile.docx
@@ -91,12 +91,6 @@
         <w:gridCol w:w="4000"/>
       </w:tblGrid>
       <w:tr>
-        <w:tblPrEx>
-          <w:tblCellMar>
-            <w:top w:w="0" w:type="dxa"/>
-            <w:bottom w:w="0" w:type="dxa"/>
-          </w:tblCellMar>
-        </w:tblPrEx>
         <w:trPr>
           <w:jc w:val="center"/>
         </w:trPr>
@@ -228,23 +222,21 @@
         </w:rPr>
         <w:t xml:space="preserve">DXEL Network — an acronym for Digital Experience and Enterprise Leadership — is a premier information technology and digital consultancy firm founded on 14 October 2021 by Md Mehedi Hasan. Headquartered in </w:t>
       </w:r>
-      <w:proofErr w:type="spellStart"/>
       <w:r>
         <w:rPr>
           <w:color w:val="1E293B"/>
           <w:sz w:val="21"/>
           <w:szCs w:val="21"/>
         </w:rPr>
-        <w:t>Kushtia</w:t>
+        <w:t>Dhaka</w:t>
       </w:r>
-      <w:proofErr w:type="spellEnd"/>
       <w:r>
         <w:rPr>
           <w:color w:val="1E293B"/>
           <w:sz w:val="21"/>
           <w:szCs w:val="21"/>
         </w:rPr>
-        <w:t>, Khulna, Bangladesh, with an international presence registered in Queens, New York, USA, DXEL Network bridges the gap between visionary businesses and transformative digital solutions.</w:t>
+        <w:t>, Bangladesh, with an international presence registered in Queens, New York, USA, DXEL Network bridges the gap between visionary businesses and transformative digital solutions.</w:t>
       </w:r>
     </w:p>
     <w:p>
@@ -424,25 +416,7 @@
           <w:sz w:val="21"/>
           <w:szCs w:val="21"/>
         </w:rPr>
-        <w:t xml:space="preserve">Excellence — We hold every </w:t>
-      </w:r>
-      <w:proofErr w:type="gramStart"/>
-      <w:r>
-        <w:rPr>
-          <w:color w:val="1E293B"/>
-          <w:sz w:val="21"/>
-          <w:szCs w:val="21"/>
-        </w:rPr>
-        <w:t>deliverable</w:t>
-      </w:r>
-      <w:proofErr w:type="gramEnd"/>
-      <w:r>
-        <w:rPr>
-          <w:color w:val="1E293B"/>
-          <w:sz w:val="21"/>
-          <w:szCs w:val="21"/>
-        </w:rPr>
-        <w:t xml:space="preserve"> to the highest standard of quality.</w:t>
+        <w:t>Excellence — We hold every deliverable to the highest standard of quality.</w:t>
       </w:r>
     </w:p>
     <w:p>
@@ -556,12 +530,6 @@
         <w:gridCol w:w="6960"/>
       </w:tblGrid>
       <w:tr>
-        <w:tblPrEx>
-          <w:tblCellMar>
-            <w:top w:w="0" w:type="dxa"/>
-            <w:bottom w:w="0" w:type="dxa"/>
-          </w:tblCellMar>
-        </w:tblPrEx>
         <w:tc>
           <w:tcPr>
             <w:tcW w:w="0" w:type="auto"/>
@@ -598,12 +566,6 @@
         </w:tc>
       </w:tr>
       <w:tr>
-        <w:tblPrEx>
-          <w:tblCellMar>
-            <w:top w:w="0" w:type="dxa"/>
-            <w:bottom w:w="0" w:type="dxa"/>
-          </w:tblCellMar>
-        </w:tblPrEx>
         <w:tc>
           <w:tcPr>
             <w:tcW w:w="2400" w:type="dxa"/>
@@ -665,12 +627,6 @@
         </w:tc>
       </w:tr>
       <w:tr>
-        <w:tblPrEx>
-          <w:tblCellMar>
-            <w:top w:w="0" w:type="dxa"/>
-            <w:bottom w:w="0" w:type="dxa"/>
-          </w:tblCellMar>
-        </w:tblPrEx>
         <w:tc>
           <w:tcPr>
             <w:tcW w:w="2400" w:type="dxa"/>
@@ -732,12 +688,6 @@
         </w:tc>
       </w:tr>
       <w:tr>
-        <w:tblPrEx>
-          <w:tblCellMar>
-            <w:top w:w="0" w:type="dxa"/>
-            <w:bottom w:w="0" w:type="dxa"/>
-          </w:tblCellMar>
-        </w:tblPrEx>
         <w:tc>
           <w:tcPr>
             <w:tcW w:w="2400" w:type="dxa"/>
@@ -799,12 +749,6 @@
         </w:tc>
       </w:tr>
       <w:tr>
-        <w:tblPrEx>
-          <w:tblCellMar>
-            <w:top w:w="0" w:type="dxa"/>
-            <w:bottom w:w="0" w:type="dxa"/>
-          </w:tblCellMar>
-        </w:tblPrEx>
         <w:tc>
           <w:tcPr>
             <w:tcW w:w="2400" w:type="dxa"/>
@@ -866,12 +810,6 @@
         </w:tc>
       </w:tr>
       <w:tr>
-        <w:tblPrEx>
-          <w:tblCellMar>
-            <w:top w:w="0" w:type="dxa"/>
-            <w:bottom w:w="0" w:type="dxa"/>
-          </w:tblCellMar>
-        </w:tblPrEx>
         <w:tc>
           <w:tcPr>
             <w:tcW w:w="2400" w:type="dxa"/>
@@ -951,12 +889,6 @@
         </w:tc>
       </w:tr>
       <w:tr>
-        <w:tblPrEx>
-          <w:tblCellMar>
-            <w:top w:w="0" w:type="dxa"/>
-            <w:bottom w:w="0" w:type="dxa"/>
-          </w:tblCellMar>
-        </w:tblPrEx>
         <w:tc>
           <w:tcPr>
             <w:tcW w:w="2400" w:type="dxa"/>
@@ -1018,12 +950,6 @@
         </w:tc>
       </w:tr>
       <w:tr>
-        <w:tblPrEx>
-          <w:tblCellMar>
-            <w:top w:w="0" w:type="dxa"/>
-            <w:bottom w:w="0" w:type="dxa"/>
-          </w:tblCellMar>
-        </w:tblPrEx>
         <w:tc>
           <w:tcPr>
             <w:tcW w:w="2400" w:type="dxa"/>
@@ -1085,12 +1011,6 @@
         </w:tc>
       </w:tr>
       <w:tr>
-        <w:tblPrEx>
-          <w:tblCellMar>
-            <w:top w:w="0" w:type="dxa"/>
-            <w:bottom w:w="0" w:type="dxa"/>
-          </w:tblCellMar>
-        </w:tblPrEx>
         <w:tc>
           <w:tcPr>
             <w:tcW w:w="2400" w:type="dxa"/>
@@ -1152,12 +1072,6 @@
         </w:tc>
       </w:tr>
       <w:tr>
-        <w:tblPrEx>
-          <w:tblCellMar>
-            <w:top w:w="0" w:type="dxa"/>
-            <w:bottom w:w="0" w:type="dxa"/>
-          </w:tblCellMar>
-        </w:tblPrEx>
         <w:tc>
           <w:tcPr>
             <w:tcW w:w="2400" w:type="dxa"/>
@@ -1219,12 +1133,6 @@
         </w:tc>
       </w:tr>
       <w:tr>
-        <w:tblPrEx>
-          <w:tblCellMar>
-            <w:top w:w="0" w:type="dxa"/>
-            <w:bottom w:w="0" w:type="dxa"/>
-          </w:tblCellMar>
-        </w:tblPrEx>
         <w:tc>
           <w:tcPr>
             <w:tcW w:w="2400" w:type="dxa"/>
@@ -1286,12 +1194,6 @@
         </w:tc>
       </w:tr>
       <w:tr>
-        <w:tblPrEx>
-          <w:tblCellMar>
-            <w:top w:w="0" w:type="dxa"/>
-            <w:bottom w:w="0" w:type="dxa"/>
-          </w:tblCellMar>
-        </w:tblPrEx>
         <w:tc>
           <w:tcPr>
             <w:tcW w:w="2400" w:type="dxa"/>
@@ -1446,12 +1348,6 @@
         <w:gridCol w:w="4680"/>
       </w:tblGrid>
       <w:tr>
-        <w:tblPrEx>
-          <w:tblCellMar>
-            <w:top w:w="0" w:type="dxa"/>
-            <w:bottom w:w="0" w:type="dxa"/>
-          </w:tblCellMar>
-        </w:tblPrEx>
         <w:tc>
           <w:tcPr>
             <w:tcW w:w="4680" w:type="dxa"/>
@@ -1536,12 +1432,6 @@
         </w:tc>
       </w:tr>
       <w:tr>
-        <w:tblPrEx>
-          <w:tblCellMar>
-            <w:top w:w="0" w:type="dxa"/>
-            <w:bottom w:w="0" w:type="dxa"/>
-          </w:tblCellMar>
-        </w:tblPrEx>
         <w:tc>
           <w:tcPr>
             <w:tcW w:w="4680" w:type="dxa"/>
@@ -1626,12 +1516,6 @@
         </w:tc>
       </w:tr>
       <w:tr>
-        <w:tblPrEx>
-          <w:tblCellMar>
-            <w:top w:w="0" w:type="dxa"/>
-            <w:bottom w:w="0" w:type="dxa"/>
-          </w:tblCellMar>
-        </w:tblPrEx>
         <w:tc>
           <w:tcPr>
             <w:tcW w:w="4680" w:type="dxa"/>
@@ -1792,12 +1676,6 @@
         <w:gridCol w:w="3120"/>
       </w:tblGrid>
       <w:tr>
-        <w:tblPrEx>
-          <w:tblCellMar>
-            <w:top w:w="0" w:type="dxa"/>
-            <w:bottom w:w="0" w:type="dxa"/>
-          </w:tblCellMar>
-        </w:tblPrEx>
         <w:tc>
           <w:tcPr>
             <w:tcW w:w="3120" w:type="dxa"/>
@@ -1899,12 +1777,6 @@
         </w:tc>
       </w:tr>
       <w:tr>
-        <w:tblPrEx>
-          <w:tblCellMar>
-            <w:top w:w="0" w:type="dxa"/>
-            <w:bottom w:w="0" w:type="dxa"/>
-          </w:tblCellMar>
-        </w:tblPrEx>
         <w:tc>
           <w:tcPr>
             <w:tcW w:w="3120" w:type="dxa"/>
@@ -2020,12 +1892,6 @@
         </w:tc>
       </w:tr>
       <w:tr>
-        <w:tblPrEx>
-          <w:tblCellMar>
-            <w:top w:w="0" w:type="dxa"/>
-            <w:bottom w:w="0" w:type="dxa"/>
-          </w:tblCellMar>
-        </w:tblPrEx>
         <w:tc>
           <w:tcPr>
             <w:tcW w:w="3120" w:type="dxa"/>
@@ -2102,47 +1968,6 @@
               <w:right w:val="single" w:sz="1" w:space="0" w:color="BFDBFE"/>
             </w:tcBorders>
             <w:shd w:val="clear" w:color="auto" w:fill="FFFFFF"/>
-            <w:tcMar>
-              <w:top w:w="100" w:type="dxa"/>
-              <w:left w:w="160" w:type="dxa"/>
-              <w:bottom w:w="100" w:type="dxa"/>
-              <w:right w:w="160" w:type="dxa"/>
-            </w:tcMar>
-          </w:tcPr>
-          <w:p>
-            <w:pPr>
-              <w:jc w:val="center"/>
-            </w:pPr>
-            <w:r>
-              <w:rPr>
-                <w:b/>
-                <w:bCs/>
-                <w:color w:val="1E293B"/>
-                <w:sz w:val="20"/>
-                <w:szCs w:val="20"/>
-              </w:rPr>
-              <w:t>Swadesh Foils Ltd</w:t>
-            </w:r>
-          </w:p>
-        </w:tc>
-      </w:tr>
-      <w:tr>
-        <w:tblPrEx>
-          <w:tblCellMar>
-            <w:top w:w="0" w:type="dxa"/>
-            <w:bottom w:w="0" w:type="dxa"/>
-          </w:tblCellMar>
-        </w:tblPrEx>
-        <w:tc>
-          <w:tcPr>
-            <w:tcW w:w="3120" w:type="dxa"/>
-            <w:tcBorders>
-              <w:top w:val="single" w:sz="1" w:space="0" w:color="BFDBFE"/>
-              <w:left w:val="single" w:sz="1" w:space="0" w:color="BFDBFE"/>
-              <w:bottom w:val="single" w:sz="1" w:space="0" w:color="BFDBFE"/>
-              <w:right w:val="single" w:sz="1" w:space="0" w:color="BFDBFE"/>
-            </w:tcBorders>
-            <w:shd w:val="clear" w:color="auto" w:fill="EFF6FF"/>
             <w:tcMar>
               <w:top w:w="100" w:type="dxa"/>
               <w:left w:w="160" w:type="dxa"/>
@@ -2163,95 +1988,13 @@
                 <w:sz w:val="20"/>
                 <w:szCs w:val="20"/>
               </w:rPr>
-              <w:t>InkPro</w:t>
+              <w:t>L’amour</w:t>
             </w:r>
             <w:proofErr w:type="spellEnd"/>
-            <w:r>
-              <w:rPr>
-                <w:b/>
-                <w:bCs/>
-                <w:color w:val="1E293B"/>
-                <w:sz w:val="20"/>
-                <w:szCs w:val="20"/>
-              </w:rPr>
-              <w:t xml:space="preserve"> Print Pack</w:t>
-            </w:r>
-          </w:p>
-        </w:tc>
-        <w:tc>
-          <w:tcPr>
-            <w:tcW w:w="3120" w:type="dxa"/>
-            <w:tcBorders>
-              <w:top w:val="single" w:sz="1" w:space="0" w:color="BFDBFE"/>
-              <w:left w:val="single" w:sz="1" w:space="0" w:color="BFDBFE"/>
-              <w:bottom w:val="single" w:sz="1" w:space="0" w:color="BFDBFE"/>
-              <w:right w:val="single" w:sz="1" w:space="0" w:color="BFDBFE"/>
-            </w:tcBorders>
-            <w:shd w:val="clear" w:color="auto" w:fill="EFF6FF"/>
-            <w:tcMar>
-              <w:top w:w="100" w:type="dxa"/>
-              <w:left w:w="160" w:type="dxa"/>
-              <w:bottom w:w="100" w:type="dxa"/>
-              <w:right w:w="160" w:type="dxa"/>
-            </w:tcMar>
-          </w:tcPr>
-          <w:p>
-            <w:pPr>
-              <w:jc w:val="center"/>
-            </w:pPr>
-            <w:r>
-              <w:rPr>
-                <w:b/>
-                <w:bCs/>
-                <w:color w:val="1E293B"/>
-                <w:sz w:val="20"/>
-                <w:szCs w:val="20"/>
-              </w:rPr>
-              <w:t>Unique Printers</w:t>
-            </w:r>
-          </w:p>
-        </w:tc>
-        <w:tc>
-          <w:tcPr>
-            <w:tcW w:w="3120" w:type="dxa"/>
-            <w:tcBorders>
-              <w:top w:val="single" w:sz="1" w:space="0" w:color="BFDBFE"/>
-              <w:left w:val="single" w:sz="1" w:space="0" w:color="BFDBFE"/>
-              <w:bottom w:val="single" w:sz="1" w:space="0" w:color="BFDBFE"/>
-              <w:right w:val="single" w:sz="1" w:space="0" w:color="BFDBFE"/>
-            </w:tcBorders>
-            <w:shd w:val="clear" w:color="auto" w:fill="EFF6FF"/>
-            <w:tcMar>
-              <w:top w:w="100" w:type="dxa"/>
-              <w:left w:w="160" w:type="dxa"/>
-              <w:bottom w:w="100" w:type="dxa"/>
-              <w:right w:w="160" w:type="dxa"/>
-            </w:tcMar>
-          </w:tcPr>
-          <w:p>
-            <w:pPr>
-              <w:jc w:val="center"/>
-            </w:pPr>
-            <w:r>
-              <w:rPr>
-                <w:b/>
-                <w:bCs/>
-                <w:color w:val="1E293B"/>
-                <w:sz w:val="20"/>
-                <w:szCs w:val="20"/>
-              </w:rPr>
-              <w:t>WM World</w:t>
-            </w:r>
           </w:p>
         </w:tc>
       </w:tr>
       <w:tr>
-        <w:tblPrEx>
-          <w:tblCellMar>
-            <w:top w:w="0" w:type="dxa"/>
-            <w:bottom w:w="0" w:type="dxa"/>
-          </w:tblCellMar>
-        </w:tblPrEx>
         <w:tc>
           <w:tcPr>
             <w:tcW w:w="3120" w:type="dxa"/>
@@ -2261,40 +2004,7 @@
               <w:bottom w:val="single" w:sz="1" w:space="0" w:color="BFDBFE"/>
               <w:right w:val="single" w:sz="1" w:space="0" w:color="BFDBFE"/>
             </w:tcBorders>
-            <w:shd w:val="clear" w:color="auto" w:fill="FFFFFF"/>
-            <w:tcMar>
-              <w:top w:w="100" w:type="dxa"/>
-              <w:left w:w="160" w:type="dxa"/>
-              <w:bottom w:w="100" w:type="dxa"/>
-              <w:right w:w="160" w:type="dxa"/>
-            </w:tcMar>
-          </w:tcPr>
-          <w:p>
-            <w:pPr>
-              <w:jc w:val="center"/>
-            </w:pPr>
-            <w:r>
-              <w:rPr>
-                <w:b/>
-                <w:bCs/>
-                <w:color w:val="1E293B"/>
-                <w:sz w:val="20"/>
-                <w:szCs w:val="20"/>
-              </w:rPr>
-              <w:t>Brownie Burg</w:t>
-            </w:r>
-          </w:p>
-        </w:tc>
-        <w:tc>
-          <w:tcPr>
-            <w:tcW w:w="3120" w:type="dxa"/>
-            <w:tcBorders>
-              <w:top w:val="single" w:sz="1" w:space="0" w:color="BFDBFE"/>
-              <w:left w:val="single" w:sz="1" w:space="0" w:color="BFDBFE"/>
-              <w:bottom w:val="single" w:sz="1" w:space="0" w:color="BFDBFE"/>
-              <w:right w:val="single" w:sz="1" w:space="0" w:color="BFDBFE"/>
-            </w:tcBorders>
-            <w:shd w:val="clear" w:color="auto" w:fill="FFFFFF"/>
+            <w:shd w:val="clear" w:color="auto" w:fill="EFF6FF"/>
             <w:tcMar>
               <w:top w:w="100" w:type="dxa"/>
               <w:left w:w="160" w:type="dxa"/>
@@ -2315,7 +2025,7 @@
                 <w:sz w:val="20"/>
                 <w:szCs w:val="20"/>
               </w:rPr>
-              <w:t>Advut</w:t>
+              <w:t>InkPro</w:t>
             </w:r>
             <w:proofErr w:type="spellEnd"/>
             <w:r>
@@ -2326,7 +2036,7 @@
                 <w:sz w:val="20"/>
                 <w:szCs w:val="20"/>
               </w:rPr>
-              <w:t xml:space="preserve"> 365</w:t>
+              <w:t xml:space="preserve"> Print Pack</w:t>
             </w:r>
           </w:p>
         </w:tc>
@@ -2339,7 +2049,7 @@
               <w:bottom w:val="single" w:sz="1" w:space="0" w:color="BFDBFE"/>
               <w:right w:val="single" w:sz="1" w:space="0" w:color="BFDBFE"/>
             </w:tcBorders>
-            <w:shd w:val="clear" w:color="auto" w:fill="FFFFFF"/>
+            <w:shd w:val="clear" w:color="auto" w:fill="EFF6FF"/>
             <w:tcMar>
               <w:top w:w="100" w:type="dxa"/>
               <w:left w:w="160" w:type="dxa"/>
@@ -2351,6 +2061,175 @@
             <w:pPr>
               <w:jc w:val="center"/>
             </w:pPr>
+            <w:r>
+              <w:rPr>
+                <w:b/>
+                <w:bCs/>
+                <w:color w:val="1E293B"/>
+                <w:sz w:val="20"/>
+                <w:szCs w:val="20"/>
+              </w:rPr>
+              <w:t>Tab</w:t>
+            </w:r>
+            <w:r>
+              <w:rPr>
+                <w:b/>
+                <w:bCs/>
+                <w:color w:val="1E293B"/>
+                <w:sz w:val="20"/>
+                <w:szCs w:val="20"/>
+              </w:rPr>
+              <w:t>le</w:t>
+            </w:r>
+          </w:p>
+        </w:tc>
+        <w:tc>
+          <w:tcPr>
+            <w:tcW w:w="3120" w:type="dxa"/>
+            <w:tcBorders>
+              <w:top w:val="single" w:sz="1" w:space="0" w:color="BFDBFE"/>
+              <w:left w:val="single" w:sz="1" w:space="0" w:color="BFDBFE"/>
+              <w:bottom w:val="single" w:sz="1" w:space="0" w:color="BFDBFE"/>
+              <w:right w:val="single" w:sz="1" w:space="0" w:color="BFDBFE"/>
+            </w:tcBorders>
+            <w:shd w:val="clear" w:color="auto" w:fill="EFF6FF"/>
+            <w:tcMar>
+              <w:top w:w="100" w:type="dxa"/>
+              <w:left w:w="160" w:type="dxa"/>
+              <w:bottom w:w="100" w:type="dxa"/>
+              <w:right w:w="160" w:type="dxa"/>
+            </w:tcMar>
+          </w:tcPr>
+          <w:p>
+            <w:pPr>
+              <w:jc w:val="center"/>
+            </w:pPr>
+            <w:r>
+              <w:rPr>
+                <w:b/>
+                <w:bCs/>
+                <w:color w:val="1E293B"/>
+                <w:sz w:val="20"/>
+                <w:szCs w:val="20"/>
+              </w:rPr>
+              <w:t>WM World</w:t>
+            </w:r>
+          </w:p>
+        </w:tc>
+      </w:tr>
+      <w:tr>
+        <w:tc>
+          <w:tcPr>
+            <w:tcW w:w="3120" w:type="dxa"/>
+            <w:tcBorders>
+              <w:top w:val="single" w:sz="1" w:space="0" w:color="BFDBFE"/>
+              <w:left w:val="single" w:sz="1" w:space="0" w:color="BFDBFE"/>
+              <w:bottom w:val="single" w:sz="1" w:space="0" w:color="BFDBFE"/>
+              <w:right w:val="single" w:sz="1" w:space="0" w:color="BFDBFE"/>
+            </w:tcBorders>
+            <w:shd w:val="clear" w:color="auto" w:fill="FFFFFF"/>
+            <w:tcMar>
+              <w:top w:w="100" w:type="dxa"/>
+              <w:left w:w="160" w:type="dxa"/>
+              <w:bottom w:w="100" w:type="dxa"/>
+              <w:right w:w="160" w:type="dxa"/>
+            </w:tcMar>
+          </w:tcPr>
+          <w:p>
+            <w:pPr>
+              <w:jc w:val="center"/>
+            </w:pPr>
+            <w:r>
+              <w:rPr>
+                <w:b/>
+                <w:bCs/>
+                <w:color w:val="1E293B"/>
+                <w:sz w:val="20"/>
+                <w:szCs w:val="20"/>
+              </w:rPr>
+              <w:t>Brownie Burg</w:t>
+            </w:r>
+          </w:p>
+        </w:tc>
+        <w:tc>
+          <w:tcPr>
+            <w:tcW w:w="3120" w:type="dxa"/>
+            <w:tcBorders>
+              <w:top w:val="single" w:sz="1" w:space="0" w:color="BFDBFE"/>
+              <w:left w:val="single" w:sz="1" w:space="0" w:color="BFDBFE"/>
+              <w:bottom w:val="single" w:sz="1" w:space="0" w:color="BFDBFE"/>
+              <w:right w:val="single" w:sz="1" w:space="0" w:color="BFDBFE"/>
+            </w:tcBorders>
+            <w:shd w:val="clear" w:color="auto" w:fill="FFFFFF"/>
+            <w:tcMar>
+              <w:top w:w="100" w:type="dxa"/>
+              <w:left w:w="160" w:type="dxa"/>
+              <w:bottom w:w="100" w:type="dxa"/>
+              <w:right w:w="160" w:type="dxa"/>
+            </w:tcMar>
+          </w:tcPr>
+          <w:p>
+            <w:pPr>
+              <w:jc w:val="center"/>
+            </w:pPr>
+            <w:proofErr w:type="spellStart"/>
+            <w:r>
+              <w:rPr>
+                <w:b/>
+                <w:bCs/>
+                <w:color w:val="1E293B"/>
+                <w:sz w:val="20"/>
+                <w:szCs w:val="20"/>
+              </w:rPr>
+              <w:t>Advut</w:t>
+            </w:r>
+            <w:proofErr w:type="spellEnd"/>
+            <w:r>
+              <w:rPr>
+                <w:b/>
+                <w:bCs/>
+                <w:color w:val="1E293B"/>
+                <w:sz w:val="20"/>
+                <w:szCs w:val="20"/>
+              </w:rPr>
+              <w:t xml:space="preserve"> 365</w:t>
+            </w:r>
+          </w:p>
+        </w:tc>
+        <w:tc>
+          <w:tcPr>
+            <w:tcW w:w="3120" w:type="dxa"/>
+            <w:tcBorders>
+              <w:top w:val="single" w:sz="1" w:space="0" w:color="BFDBFE"/>
+              <w:left w:val="single" w:sz="1" w:space="0" w:color="BFDBFE"/>
+              <w:bottom w:val="single" w:sz="1" w:space="0" w:color="BFDBFE"/>
+              <w:right w:val="single" w:sz="1" w:space="0" w:color="BFDBFE"/>
+            </w:tcBorders>
+            <w:shd w:val="clear" w:color="auto" w:fill="FFFFFF"/>
+            <w:tcMar>
+              <w:top w:w="100" w:type="dxa"/>
+              <w:left w:w="160" w:type="dxa"/>
+              <w:bottom w:w="100" w:type="dxa"/>
+              <w:right w:w="160" w:type="dxa"/>
+            </w:tcMar>
+          </w:tcPr>
+          <w:p>
+            <w:pPr>
+              <w:jc w:val="center"/>
+              <w:rPr>
+                <w:b/>
+                <w:bCs/>
+              </w:rPr>
+            </w:pPr>
+            <w:r>
+              <w:rPr>
+                <w:b/>
+                <w:bCs/>
+                <w:sz w:val="20"/>
+                <w:szCs w:val="20"/>
+              </w:rPr>
+              <w:t>Special Gift</w:t>
+            </w:r>
           </w:p>
         </w:tc>
       </w:tr>
@@ -2449,12 +2328,6 @@
         <w:gridCol w:w="6560"/>
       </w:tblGrid>
       <w:tr>
-        <w:tblPrEx>
-          <w:tblCellMar>
-            <w:top w:w="0" w:type="dxa"/>
-            <w:bottom w:w="0" w:type="dxa"/>
-          </w:tblCellMar>
-        </w:tblPrEx>
         <w:tc>
           <w:tcPr>
             <w:tcW w:w="2800" w:type="dxa"/>
@@ -2515,12 +2388,6 @@
         </w:tc>
       </w:tr>
       <w:tr>
-        <w:tblPrEx>
-          <w:tblCellMar>
-            <w:top w:w="0" w:type="dxa"/>
-            <w:bottom w:w="0" w:type="dxa"/>
-          </w:tblCellMar>
-        </w:tblPrEx>
         <w:tc>
           <w:tcPr>
             <w:tcW w:w="2800" w:type="dxa"/>
@@ -2581,12 +2448,6 @@
         </w:tc>
       </w:tr>
       <w:tr>
-        <w:tblPrEx>
-          <w:tblCellMar>
-            <w:top w:w="0" w:type="dxa"/>
-            <w:bottom w:w="0" w:type="dxa"/>
-          </w:tblCellMar>
-        </w:tblPrEx>
         <w:tc>
           <w:tcPr>
             <w:tcW w:w="2800" w:type="dxa"/>
@@ -2647,12 +2508,6 @@
         </w:tc>
       </w:tr>
       <w:tr>
-        <w:tblPrEx>
-          <w:tblCellMar>
-            <w:top w:w="0" w:type="dxa"/>
-            <w:bottom w:w="0" w:type="dxa"/>
-          </w:tblCellMar>
-        </w:tblPrEx>
         <w:tc>
           <w:tcPr>
             <w:tcW w:w="2800" w:type="dxa"/>
@@ -2713,12 +2568,6 @@
         </w:tc>
       </w:tr>
       <w:tr>
-        <w:tblPrEx>
-          <w:tblCellMar>
-            <w:top w:w="0" w:type="dxa"/>
-            <w:bottom w:w="0" w:type="dxa"/>
-          </w:tblCellMar>
-        </w:tblPrEx>
         <w:tc>
           <w:tcPr>
             <w:tcW w:w="2800" w:type="dxa"/>
@@ -2779,12 +2628,6 @@
         </w:tc>
       </w:tr>
       <w:tr>
-        <w:tblPrEx>
-          <w:tblCellMar>
-            <w:top w:w="0" w:type="dxa"/>
-            <w:bottom w:w="0" w:type="dxa"/>
-          </w:tblCellMar>
-        </w:tblPrEx>
         <w:tc>
           <w:tcPr>
             <w:tcW w:w="2800" w:type="dxa"/>
@@ -2845,12 +2688,6 @@
         </w:tc>
       </w:tr>
       <w:tr>
-        <w:tblPrEx>
-          <w:tblCellMar>
-            <w:top w:w="0" w:type="dxa"/>
-            <w:bottom w:w="0" w:type="dxa"/>
-          </w:tblCellMar>
-        </w:tblPrEx>
         <w:tc>
           <w:tcPr>
             <w:tcW w:w="2800" w:type="dxa"/>
@@ -2911,12 +2748,6 @@
         </w:tc>
       </w:tr>
       <w:tr>
-        <w:tblPrEx>
-          <w:tblCellMar>
-            <w:top w:w="0" w:type="dxa"/>
-            <w:bottom w:w="0" w:type="dxa"/>
-          </w:tblCellMar>
-        </w:tblPrEx>
         <w:tc>
           <w:tcPr>
             <w:tcW w:w="2800" w:type="dxa"/>
@@ -2965,52 +2796,26 @@
             </w:tcMar>
           </w:tcPr>
           <w:p>
-            <w:proofErr w:type="spellStart"/>
-            <w:r>
-              <w:rPr>
-                <w:color w:val="1E293B"/>
-                <w:sz w:val="19"/>
-                <w:szCs w:val="19"/>
-              </w:rPr>
-              <w:t>Jhaudia</w:t>
-            </w:r>
-            <w:proofErr w:type="spellEnd"/>
-            <w:r>
-              <w:rPr>
-                <w:color w:val="1E293B"/>
-                <w:sz w:val="19"/>
-                <w:szCs w:val="19"/>
-              </w:rPr>
-              <w:t xml:space="preserve"> Majhpara, Islamic University, </w:t>
-            </w:r>
-            <w:proofErr w:type="spellStart"/>
-            <w:r>
-              <w:rPr>
-                <w:color w:val="1E293B"/>
-                <w:sz w:val="19"/>
-                <w:szCs w:val="19"/>
-              </w:rPr>
-              <w:t>Kushtia</w:t>
-            </w:r>
-            <w:proofErr w:type="spellEnd"/>
-            <w:r>
-              <w:rPr>
-                <w:color w:val="1E293B"/>
-                <w:sz w:val="19"/>
-                <w:szCs w:val="19"/>
-              </w:rPr>
-              <w:t>, Khulna 7002, Bangladesh</w:t>
+            <w:r>
+              <w:rPr>
+                <w:color w:val="1E293B"/>
+                <w:sz w:val="19"/>
+                <w:szCs w:val="19"/>
+              </w:rPr>
+              <w:t>Dhaka</w:t>
+            </w:r>
+            <w:r>
+              <w:rPr>
+                <w:color w:val="1E293B"/>
+                <w:sz w:val="19"/>
+                <w:szCs w:val="19"/>
+              </w:rPr>
+              <w:t>, Bangladesh</w:t>
             </w:r>
           </w:p>
         </w:tc>
       </w:tr>
       <w:tr>
-        <w:tblPrEx>
-          <w:tblCellMar>
-            <w:top w:w="0" w:type="dxa"/>
-            <w:bottom w:w="0" w:type="dxa"/>
-          </w:tblCellMar>
-        </w:tblPrEx>
         <w:tc>
           <w:tcPr>
             <w:tcW w:w="2800" w:type="dxa"/>
@@ -3065,18 +2870,28 @@
                 <w:sz w:val="19"/>
                 <w:szCs w:val="19"/>
               </w:rPr>
-              <w:t>164-12 85th Ave, Jamaica, Queens, NY 11432, United States</w:t>
+              <w:t>Queens, N</w:t>
+            </w:r>
+            <w:r>
+              <w:rPr>
+                <w:color w:val="1E293B"/>
+                <w:sz w:val="19"/>
+                <w:szCs w:val="19"/>
+              </w:rPr>
+              <w:t>Y</w:t>
+            </w:r>
+            <w:r>
+              <w:rPr>
+                <w:color w:val="1E293B"/>
+                <w:sz w:val="19"/>
+                <w:szCs w:val="19"/>
+              </w:rPr>
+              <w:t>, United States</w:t>
             </w:r>
           </w:p>
         </w:tc>
       </w:tr>
       <w:tr>
-        <w:tblPrEx>
-          <w:tblCellMar>
-            <w:top w:w="0" w:type="dxa"/>
-            <w:bottom w:w="0" w:type="dxa"/>
-          </w:tblCellMar>
-        </w:tblPrEx>
         <w:tc>
           <w:tcPr>
             <w:tcW w:w="2800" w:type="dxa"/>
@@ -3137,12 +2952,6 @@
         </w:tc>
       </w:tr>
       <w:tr>
-        <w:tblPrEx>
-          <w:tblCellMar>
-            <w:top w:w="0" w:type="dxa"/>
-            <w:bottom w:w="0" w:type="dxa"/>
-          </w:tblCellMar>
-        </w:tblPrEx>
         <w:tc>
           <w:tcPr>
             <w:tcW w:w="2800" w:type="dxa"/>
@@ -3203,12 +3012,6 @@
         </w:tc>
       </w:tr>
       <w:tr>
-        <w:tblPrEx>
-          <w:tblCellMar>
-            <w:top w:w="0" w:type="dxa"/>
-            <w:bottom w:w="0" w:type="dxa"/>
-          </w:tblCellMar>
-        </w:tblPrEx>
         <w:tc>
           <w:tcPr>
             <w:tcW w:w="2800" w:type="dxa"/>
@@ -3269,12 +3072,6 @@
         </w:tc>
       </w:tr>
       <w:tr>
-        <w:tblPrEx>
-          <w:tblCellMar>
-            <w:top w:w="0" w:type="dxa"/>
-            <w:bottom w:w="0" w:type="dxa"/>
-          </w:tblCellMar>
-        </w:tblPrEx>
         <w:tc>
           <w:tcPr>
             <w:tcW w:w="2800" w:type="dxa"/>
@@ -3335,12 +3132,6 @@
         </w:tc>
       </w:tr>
       <w:tr>
-        <w:tblPrEx>
-          <w:tblCellMar>
-            <w:top w:w="0" w:type="dxa"/>
-            <w:bottom w:w="0" w:type="dxa"/>
-          </w:tblCellMar>
-        </w:tblPrEx>
         <w:tc>
           <w:tcPr>
             <w:tcW w:w="2800" w:type="dxa"/>
@@ -3401,12 +3192,6 @@
         </w:tc>
       </w:tr>
       <w:tr>
-        <w:tblPrEx>
-          <w:tblCellMar>
-            <w:top w:w="0" w:type="dxa"/>
-            <w:bottom w:w="0" w:type="dxa"/>
-          </w:tblCellMar>
-        </w:tblPrEx>
         <w:tc>
           <w:tcPr>
             <w:tcW w:w="2800" w:type="dxa"/>
@@ -3477,12 +3262,6 @@
         </w:tc>
       </w:tr>
       <w:tr>
-        <w:tblPrEx>
-          <w:tblCellMar>
-            <w:top w:w="0" w:type="dxa"/>
-            <w:bottom w:w="0" w:type="dxa"/>
-          </w:tblCellMar>
-        </w:tblPrEx>
         <w:tc>
           <w:tcPr>
             <w:tcW w:w="2800" w:type="dxa"/>

</xml_diff>